<commit_message>
update to test report
</commit_message>
<xml_diff>
--- a/ULTIMA/Phase 1/03 _ Test/DBB - Phase1 Test Report.docx
+++ b/ULTIMA/Phase 1/03 _ Test/DBB - Phase1 Test Report.docx
@@ -51,6 +51,7 @@
     <w:p>
       <w:pPr>
         <w:spacing w:after="0" w:line="240" w:lineRule="auto"/>
+        <w:ind w:firstLine="720"/>
         <w:rPr>
           <w:rFonts w:ascii="Times New Roman" w:hAnsi="Times New Roman" w:cs="Times New Roman"/>
         </w:rPr>
@@ -174,7 +175,7 @@
           <w:rFonts w:ascii="Times New Roman" w:hAnsi="Times New Roman" w:cs="Times New Roman"/>
         </w:rPr>
         <w:pict w14:anchorId="3620F7F2">
-          <v:rect id="_x0000_i1049" style="width:0;height:1.5pt" o:hralign="center" o:hrstd="t" o:hr="t" fillcolor="#a0a0a0" stroked="f"/>
+          <v:rect id="_x0000_i1025" style="width:0;height:1.5pt" o:hralign="center" o:hrstd="t" o:hr="t" fillcolor="#a0a0a0" stroked="f"/>
         </w:pict>
       </w:r>
     </w:p>
@@ -209,6 +210,7 @@
     <w:p>
       <w:pPr>
         <w:spacing w:after="0" w:line="240" w:lineRule="auto"/>
+        <w:ind w:firstLine="720"/>
         <w:rPr>
           <w:rFonts w:ascii="Times New Roman" w:hAnsi="Times New Roman" w:cs="Times New Roman"/>
         </w:rPr>
@@ -407,7 +409,7 @@
         </w:rPr>
         <w:lastRenderedPageBreak/>
         <w:pict w14:anchorId="29D4D1B6">
-          <v:rect id="_x0000_i1050" style="width:0;height:1.5pt" o:hralign="center" o:hrstd="t" o:hr="t" fillcolor="#a0a0a0" stroked="f"/>
+          <v:rect id="_x0000_i1026" style="width:0;height:1.5pt" o:hralign="center" o:hrstd="t" o:hr="t" fillcolor="#a0a0a0" stroked="f"/>
         </w:pict>
       </w:r>
     </w:p>
@@ -442,6 +444,7 @@
     <w:p>
       <w:pPr>
         <w:spacing w:after="0" w:line="240" w:lineRule="auto"/>
+        <w:ind w:firstLine="720"/>
         <w:rPr>
           <w:rFonts w:ascii="Times New Roman" w:hAnsi="Times New Roman" w:cs="Times New Roman"/>
         </w:rPr>
@@ -559,7 +562,7 @@
           <w:rFonts w:ascii="Times New Roman" w:hAnsi="Times New Roman" w:cs="Times New Roman"/>
         </w:rPr>
         <w:pict w14:anchorId="647E01F1">
-          <v:rect id="_x0000_i1051" style="width:0;height:1.5pt" o:hralign="center" o:hrstd="t" o:hr="t" fillcolor="#a0a0a0" stroked="f"/>
+          <v:rect id="_x0000_i1027" style="width:0;height:1.5pt" o:hralign="center" o:hrstd="t" o:hr="t" fillcolor="#a0a0a0" stroked="f"/>
         </w:pict>
       </w:r>
     </w:p>
@@ -594,6 +597,7 @@
     <w:p>
       <w:pPr>
         <w:spacing w:after="0" w:line="240" w:lineRule="auto"/>
+        <w:ind w:firstLine="720"/>
         <w:rPr>
           <w:rFonts w:ascii="Times New Roman" w:hAnsi="Times New Roman" w:cs="Times New Roman"/>
         </w:rPr>
@@ -739,7 +743,7 @@
           <w:rFonts w:ascii="Times New Roman" w:hAnsi="Times New Roman" w:cs="Times New Roman"/>
         </w:rPr>
         <w:pict w14:anchorId="511D57B0">
-          <v:rect id="_x0000_i1052" style="width:0;height:1.5pt" o:hralign="center" o:hrstd="t" o:hr="t" fillcolor="#a0a0a0" stroked="f"/>
+          <v:rect id="_x0000_i1028" style="width:0;height:1.5pt" o:hralign="center" o:hrstd="t" o:hr="t" fillcolor="#a0a0a0" stroked="f"/>
         </w:pict>
       </w:r>
     </w:p>
@@ -774,6 +778,7 @@
     <w:p>
       <w:pPr>
         <w:spacing w:after="0" w:line="240" w:lineRule="auto"/>
+        <w:ind w:firstLine="720"/>
         <w:rPr>
           <w:rFonts w:ascii="Times New Roman" w:hAnsi="Times New Roman" w:cs="Times New Roman"/>
         </w:rPr>
@@ -823,19 +828,12 @@
           <w:b/>
           <w:bCs/>
         </w:rPr>
-        <w:t>Task Creation (Scheduler Setup)</w:t>
-      </w:r>
-      <w:r>
-        <w:rPr>
-          <w:rFonts w:ascii="Times New Roman" w:hAnsi="Times New Roman" w:cs="Times New Roman"/>
-          <w:b/>
-          <w:bCs/>
-        </w:rPr>
-        <w:t>:</w:t>
-      </w:r>
-    </w:p>
-    <w:p>
-      <w:pPr>
+        <w:t>Task Creation (Scheduler Setup):</w:t>
+      </w:r>
+    </w:p>
+    <w:p>
+      <w:pPr>
+        <w:ind w:firstLine="720"/>
         <w:rPr>
           <w:rFonts w:ascii="Times New Roman" w:hAnsi="Times New Roman" w:cs="Times New Roman"/>
         </w:rPr>
@@ -973,7 +971,7 @@
           <w:rFonts w:ascii="Times New Roman" w:hAnsi="Times New Roman" w:cs="Times New Roman"/>
         </w:rPr>
         <w:pict w14:anchorId="5196357C">
-          <v:rect id="_x0000_i1093" style="width:0;height:1.5pt" o:hralign="center" o:hrstd="t" o:hr="t" fillcolor="#a0a0a0" stroked="f"/>
+          <v:rect id="_x0000_i1029" style="width:0;height:1.5pt" o:hralign="center" o:hrstd="t" o:hr="t" fillcolor="#a0a0a0" stroked="f"/>
         </w:pict>
       </w:r>
     </w:p>
@@ -991,19 +989,12 @@
           <w:b/>
           <w:bCs/>
         </w:rPr>
-        <w:t>Semaphore Acquire (Lock Resource)</w:t>
-      </w:r>
-      <w:r>
-        <w:rPr>
-          <w:rFonts w:ascii="Times New Roman" w:hAnsi="Times New Roman" w:cs="Times New Roman"/>
-          <w:b/>
-          <w:bCs/>
-        </w:rPr>
-        <w:t>:</w:t>
-      </w:r>
-    </w:p>
-    <w:p>
-      <w:pPr>
+        <w:t>Semaphore Acquire (Lock Resource):</w:t>
+      </w:r>
+    </w:p>
+    <w:p>
+      <w:pPr>
+        <w:ind w:firstLine="720"/>
         <w:rPr>
           <w:rFonts w:ascii="Times New Roman" w:hAnsi="Times New Roman" w:cs="Times New Roman"/>
         </w:rPr>
@@ -1138,7 +1129,7 @@
           <w:rFonts w:ascii="Times New Roman" w:hAnsi="Times New Roman" w:cs="Times New Roman"/>
         </w:rPr>
         <w:pict w14:anchorId="0A8EB55C">
-          <v:rect id="_x0000_i1094" style="width:0;height:1.5pt" o:hralign="center" o:hrstd="t" o:hr="t" fillcolor="#a0a0a0" stroked="f"/>
+          <v:rect id="_x0000_i1030" style="width:0;height:1.5pt" o:hralign="center" o:hrstd="t" o:hr="t" fillcolor="#a0a0a0" stroked="f"/>
         </w:pict>
       </w:r>
     </w:p>
@@ -1156,19 +1147,12 @@
           <w:b/>
           <w:bCs/>
         </w:rPr>
-        <w:t>Semaphore Release (Unlock Resource)</w:t>
-      </w:r>
-      <w:r>
-        <w:rPr>
-          <w:rFonts w:ascii="Times New Roman" w:hAnsi="Times New Roman" w:cs="Times New Roman"/>
-          <w:b/>
-          <w:bCs/>
-        </w:rPr>
-        <w:t>:</w:t>
-      </w:r>
-    </w:p>
-    <w:p>
-      <w:pPr>
+        <w:t>Semaphore Release (Unlock Resource):</w:t>
+      </w:r>
+    </w:p>
+    <w:p>
+      <w:pPr>
+        <w:ind w:firstLine="720"/>
         <w:rPr>
           <w:rFonts w:ascii="Times New Roman" w:hAnsi="Times New Roman" w:cs="Times New Roman"/>
         </w:rPr>
@@ -1300,7 +1284,7 @@
         </w:rPr>
         <w:lastRenderedPageBreak/>
         <w:pict w14:anchorId="1FD03FB3">
-          <v:rect id="_x0000_i1095" style="width:0;height:1.5pt" o:hralign="center" o:hrstd="t" o:hr="t" fillcolor="#a0a0a0" stroked="f"/>
+          <v:rect id="_x0000_i1031" style="width:0;height:1.5pt" o:hralign="center" o:hrstd="t" o:hr="t" fillcolor="#a0a0a0" stroked="f"/>
         </w:pict>
       </w:r>
     </w:p>
@@ -1318,19 +1302,12 @@
           <w:b/>
           <w:bCs/>
         </w:rPr>
-        <w:t>Scheduler Yield (Context Switch)</w:t>
-      </w:r>
-      <w:r>
-        <w:rPr>
-          <w:rFonts w:ascii="Times New Roman" w:hAnsi="Times New Roman" w:cs="Times New Roman"/>
-          <w:b/>
-          <w:bCs/>
-        </w:rPr>
-        <w:t>:</w:t>
-      </w:r>
-    </w:p>
-    <w:p>
-      <w:pPr>
+        <w:t>Scheduler Yield (Context Switch):</w:t>
+      </w:r>
+    </w:p>
+    <w:p>
+      <w:pPr>
+        <w:ind w:firstLine="720"/>
         <w:rPr>
           <w:rFonts w:ascii="Times New Roman" w:hAnsi="Times New Roman" w:cs="Times New Roman"/>
         </w:rPr>
@@ -1353,21 +1330,7 @@
         <w:rPr>
           <w:rFonts w:ascii="Times New Roman" w:hAnsi="Times New Roman" w:cs="Times New Roman"/>
         </w:rPr>
-        <w:t xml:space="preserve">() to switch from the current task to another ready task. This allows the scheduler to move between tasks </w:t>
-      </w:r>
-      <w:proofErr w:type="gramStart"/>
-      <w:r>
-        <w:rPr>
-          <w:rFonts w:ascii="Times New Roman" w:hAnsi="Times New Roman" w:cs="Times New Roman"/>
-        </w:rPr>
-        <w:t>fairly instead</w:t>
-      </w:r>
-      <w:proofErr w:type="gramEnd"/>
-      <w:r>
-        <w:rPr>
-          <w:rFonts w:ascii="Times New Roman" w:hAnsi="Times New Roman" w:cs="Times New Roman"/>
-        </w:rPr>
-        <w:t xml:space="preserve"> of letting one task run forever. This shows that we are correctly handling context switching in the system.</w:t>
+        <w:t>() to switch between tasks using a round-robin scheduler. The scheduler loops through all tasks and only selects tasks that are in the READY state. If no READY tasks are available, the system prints a message indicating this. This shows proper context switching and task state management.</w:t>
       </w:r>
     </w:p>
     <w:p>
@@ -1461,7 +1424,7 @@
           <w:rFonts w:ascii="Times New Roman" w:hAnsi="Times New Roman" w:cs="Times New Roman"/>
         </w:rPr>
         <w:pict w14:anchorId="13286F20">
-          <v:rect id="_x0000_i1096" style="width:0;height:1.5pt" o:hralign="center" o:hrstd="t" o:hr="t" fillcolor="#a0a0a0" stroked="f"/>
+          <v:rect id="_x0000_i1032" style="width:0;height:1.5pt" o:hralign="center" o:hrstd="t" o:hr="t" fillcolor="#a0a0a0" stroked="f"/>
         </w:pict>
       </w:r>
     </w:p>
@@ -1479,19 +1442,12 @@
           <w:b/>
           <w:bCs/>
         </w:rPr>
-        <w:t>Debug Output (System State Verification)</w:t>
-      </w:r>
-      <w:r>
-        <w:rPr>
-          <w:rFonts w:ascii="Times New Roman" w:hAnsi="Times New Roman" w:cs="Times New Roman"/>
-          <w:b/>
-          <w:bCs/>
-        </w:rPr>
-        <w:t>:</w:t>
-      </w:r>
-    </w:p>
-    <w:p>
-      <w:pPr>
+        <w:t>Debug Output (System State Verification):</w:t>
+      </w:r>
+    </w:p>
+    <w:p>
+      <w:pPr>
+        <w:ind w:firstLine="720"/>
         <w:rPr>
           <w:rFonts w:ascii="Times New Roman" w:hAnsi="Times New Roman" w:cs="Times New Roman"/>
         </w:rPr>

</xml_diff>